<commit_message>
finished reporting about protein and its structure
</commit_message>
<xml_diff>
--- a/reports/report 1.docx
+++ b/reports/report 1.docx
@@ -216,7 +216,7 @@
         </w:numPr>
       </w:pPr>
       <w:r>
-        <w:t>. An amino group (-NH2)</w:t>
+        <w:t xml:space="preserve"> An amino group (-NH2)</w:t>
       </w:r>
     </w:p>
     <w:p>
@@ -228,7 +228,7 @@
         </w:numPr>
       </w:pPr>
       <w:r>
-        <w:t>. A carboxyl group (-COOH)</w:t>
+        <w:t xml:space="preserve"> A carboxyl group (-COOH)</w:t>
       </w:r>
     </w:p>
     <w:p>
@@ -240,16 +240,7 @@
         </w:numPr>
       </w:pPr>
       <w:r>
-        <w:t>. A side chain (R group) - the only part that varies between amino acids and determines their chemical</w:t>
-      </w:r>
-      <w:r>
-        <w:t xml:space="preserve"> </w:t>
-      </w:r>
-      <w:r>
-        <w:t>properties</w:t>
-      </w:r>
-      <w:r>
-        <w:t>.</w:t>
+        <w:t xml:space="preserve"> A side chain (R group) - the only part that varies between amino acids and determines their chemical properties.</w:t>
       </w:r>
     </w:p>
     <w:p>
@@ -257,6 +248,9 @@
         <w:jc w:val="center"/>
       </w:pPr>
       <w:r>
+        <w:rPr>
+          <w:noProof/>
+        </w:rPr>
         <w:drawing>
           <wp:inline distT="0" distB="0" distL="0" distR="0" wp14:anchorId="3907CA28" wp14:editId="7AE3308D">
             <wp:extent cx="3360711" cy="2118544"/>
@@ -422,6 +416,9 @@
         <w:jc w:val="center"/>
       </w:pPr>
       <w:r>
+        <w:rPr>
+          <w:noProof/>
+        </w:rPr>
         <w:lastRenderedPageBreak/>
         <w:drawing>
           <wp:inline distT="0" distB="0" distL="0" distR="0" wp14:anchorId="03FF9614" wp14:editId="27FA264E">
@@ -472,6 +469,9 @@
         <w:jc w:val="center"/>
       </w:pPr>
       <w:r>
+        <w:rPr>
+          <w:noProof/>
+        </w:rPr>
         <w:drawing>
           <wp:inline distT="0" distB="0" distL="0" distR="0" wp14:anchorId="10A46821" wp14:editId="6AB9756C">
             <wp:extent cx="5943600" cy="4224020"/>
@@ -509,6 +509,209 @@
         </w:drawing>
       </w:r>
     </w:p>
+    <w:p>
+      <w:pPr>
+        <w:ind w:left="360"/>
+        <w:jc w:val="center"/>
+      </w:pPr>
+    </w:p>
+    <w:p>
+      <w:pPr>
+        <w:ind w:left="360"/>
+        <w:rPr>
+          <w:b/>
+          <w:bCs/>
+          <w:u w:val="single"/>
+        </w:rPr>
+      </w:pPr>
+      <w:r>
+        <w:rPr>
+          <w:b/>
+          <w:bCs/>
+          <w:u w:val="single"/>
+        </w:rPr>
+        <w:t>SECONDARY STRUCTURE OF PROTEINS:</w:t>
+      </w:r>
+    </w:p>
+    <w:p>
+      <w:pPr>
+        <w:pStyle w:val="ListParagraph"/>
+        <w:numPr>
+          <w:ilvl w:val="0"/>
+          <w:numId w:val="5"/>
+        </w:numPr>
+      </w:pPr>
+      <w:r>
+        <w:lastRenderedPageBreak/>
+        <w:t>Alpha helix: It’s a right-handed coil stabilized by hydrogen bonds between nearby amine and carboxylic groups.</w:t>
+      </w:r>
+    </w:p>
+    <w:p>
+      <w:pPr>
+        <w:pStyle w:val="ListParagraph"/>
+        <w:numPr>
+          <w:ilvl w:val="0"/>
+          <w:numId w:val="5"/>
+        </w:numPr>
+      </w:pPr>
+      <w:r>
+        <w:t>Beta sheet: It is formed when hydrogen bonds stabilize two or more adjacent strands.</w:t>
+      </w:r>
+    </w:p>
+    <w:p>
+      <w:pPr>
+        <w:pStyle w:val="ListParagraph"/>
+        <w:ind w:left="1080"/>
+      </w:pPr>
+    </w:p>
+    <w:p>
+      <w:pPr>
+        <w:pStyle w:val="ListParagraph"/>
+        <w:ind w:left="1080"/>
+        <w:jc w:val="center"/>
+      </w:pPr>
+      <w:r>
+        <w:drawing>
+          <wp:inline distT="0" distB="0" distL="0" distR="0" wp14:anchorId="0D13A920" wp14:editId="464BD5B7">
+            <wp:extent cx="3985605" cy="2110923"/>
+            <wp:effectExtent l="0" t="0" r="0" b="3810"/>
+            <wp:docPr id="935857354" name="Picture 1"/>
+            <wp:cNvGraphicFramePr>
+              <a:graphicFrameLocks xmlns:a="http://schemas.openxmlformats.org/drawingml/2006/main" noChangeAspect="1"/>
+            </wp:cNvGraphicFramePr>
+            <a:graphic xmlns:a="http://schemas.openxmlformats.org/drawingml/2006/main">
+              <a:graphicData uri="http://schemas.openxmlformats.org/drawingml/2006/picture">
+                <pic:pic xmlns:pic="http://schemas.openxmlformats.org/drawingml/2006/picture">
+                  <pic:nvPicPr>
+                    <pic:cNvPr id="935857354" name=""/>
+                    <pic:cNvPicPr/>
+                  </pic:nvPicPr>
+                  <pic:blipFill>
+                    <a:blip r:embed="rId8"/>
+                    <a:stretch>
+                      <a:fillRect/>
+                    </a:stretch>
+                  </pic:blipFill>
+                  <pic:spPr>
+                    <a:xfrm>
+                      <a:off x="0" y="0"/>
+                      <a:ext cx="3985605" cy="2110923"/>
+                    </a:xfrm>
+                    <a:prstGeom prst="rect">
+                      <a:avLst/>
+                    </a:prstGeom>
+                  </pic:spPr>
+                </pic:pic>
+              </a:graphicData>
+            </a:graphic>
+          </wp:inline>
+        </w:drawing>
+      </w:r>
+    </w:p>
+    <w:p>
+      <w:pPr>
+        <w:pStyle w:val="ListParagraph"/>
+        <w:ind w:left="1080"/>
+        <w:jc w:val="center"/>
+      </w:pPr>
+    </w:p>
+    <w:p>
+      <w:pPr>
+        <w:rPr>
+          <w:b/>
+          <w:bCs/>
+          <w:u w:val="single"/>
+        </w:rPr>
+      </w:pPr>
+      <w:r>
+        <w:rPr>
+          <w:b/>
+          <w:bCs/>
+          <w:u w:val="single"/>
+        </w:rPr>
+        <w:t xml:space="preserve">TERTIARY </w:t>
+      </w:r>
+      <w:r>
+        <w:rPr>
+          <w:b/>
+          <w:bCs/>
+          <w:u w:val="single"/>
+        </w:rPr>
+        <w:t>STRUCTURE OF PROTEINS:</w:t>
+      </w:r>
+    </w:p>
+    <w:p>
+      <w:r>
+        <w:t>The tertiary structure is the overall 3D shape of a single protein chain, determined by the properties of its</w:t>
+      </w:r>
+      <w:r>
+        <w:t xml:space="preserve"> </w:t>
+      </w:r>
+      <w:r>
+        <w:t>amino acids.</w:t>
+      </w:r>
+    </w:p>
+    <w:p>
+      <w:pPr>
+        <w:pStyle w:val="ListParagraph"/>
+        <w:numPr>
+          <w:ilvl w:val="0"/>
+          <w:numId w:val="6"/>
+        </w:numPr>
+      </w:pPr>
+      <w:r>
+        <w:t>Many proteins fold into globular shapes with hydrophobic side chains tucked inside, shielded from</w:t>
+      </w:r>
+      <w:r>
+        <w:t xml:space="preserve"> </w:t>
+      </w:r>
+      <w:r>
+        <w:t>surrounding water.</w:t>
+      </w:r>
+    </w:p>
+    <w:p>
+      <w:pPr>
+        <w:pStyle w:val="ListParagraph"/>
+        <w:numPr>
+          <w:ilvl w:val="0"/>
+          <w:numId w:val="6"/>
+        </w:numPr>
+      </w:pPr>
+      <w:r>
+        <w:t>Membrane-bound proteins instead cluster hydrophobic residues on the outside, allowing them to interact wit</w:t>
+      </w:r>
+      <w:r>
+        <w:t xml:space="preserve">h </w:t>
+      </w:r>
+      <w:r>
+        <w:t>lipid membranes.</w:t>
+      </w:r>
+    </w:p>
+    <w:p>
+      <w:pPr>
+        <w:pStyle w:val="ListParagraph"/>
+        <w:numPr>
+          <w:ilvl w:val="0"/>
+          <w:numId w:val="6"/>
+        </w:numPr>
+      </w:pPr>
+      <w:r>
+        <w:t>Charged amino acids let proteins interact with molecules bearing complementary (opposite) charges.</w:t>
+      </w:r>
+    </w:p>
+    <w:p/>
+    <w:p/>
+    <w:p>
+      <w:pPr>
+        <w:ind w:left="360"/>
+        <w:jc w:val="center"/>
+      </w:pPr>
+    </w:p>
+    <w:p>
+      <w:pPr>
+        <w:ind w:left="360"/>
+      </w:pPr>
+    </w:p>
     <w:sectPr>
       <w:pgSz w:w="12240" w:h="15840"/>
       <w:pgMar w:top="1440" w:right="1440" w:bottom="1440" w:left="1440" w:header="708" w:footer="708" w:gutter="0"/>
@@ -611,6 +814,184 @@
     </w:lvl>
   </w:abstractNum>
   <w:abstractNum w:abstractNumId="1" w15:restartNumberingAfterBreak="0">
+    <w:nsid w:val="443D1176"/>
+    <w:multiLevelType w:val="hybridMultilevel"/>
+    <w:tmpl w:val="A35803FA"/>
+    <w:lvl w:ilvl="0" w:tplc="D674B176">
+      <w:start w:val="1"/>
+      <w:numFmt w:val="lowerRoman"/>
+      <w:lvlText w:val="(%1)"/>
+      <w:lvlJc w:val="left"/>
+      <w:pPr>
+        <w:ind w:left="1080" w:hanging="720"/>
+      </w:pPr>
+      <w:rPr>
+        <w:rFonts w:hint="default"/>
+      </w:rPr>
+    </w:lvl>
+    <w:lvl w:ilvl="1" w:tplc="04090019" w:tentative="1">
+      <w:start w:val="1"/>
+      <w:numFmt w:val="lowerLetter"/>
+      <w:lvlText w:val="%2."/>
+      <w:lvlJc w:val="left"/>
+      <w:pPr>
+        <w:ind w:left="1440" w:hanging="360"/>
+      </w:pPr>
+    </w:lvl>
+    <w:lvl w:ilvl="2" w:tplc="0409001B" w:tentative="1">
+      <w:start w:val="1"/>
+      <w:numFmt w:val="lowerRoman"/>
+      <w:lvlText w:val="%3."/>
+      <w:lvlJc w:val="right"/>
+      <w:pPr>
+        <w:ind w:left="2160" w:hanging="180"/>
+      </w:pPr>
+    </w:lvl>
+    <w:lvl w:ilvl="3" w:tplc="0409000F" w:tentative="1">
+      <w:start w:val="1"/>
+      <w:numFmt w:val="decimal"/>
+      <w:lvlText w:val="%4."/>
+      <w:lvlJc w:val="left"/>
+      <w:pPr>
+        <w:ind w:left="2880" w:hanging="360"/>
+      </w:pPr>
+    </w:lvl>
+    <w:lvl w:ilvl="4" w:tplc="04090019" w:tentative="1">
+      <w:start w:val="1"/>
+      <w:numFmt w:val="lowerLetter"/>
+      <w:lvlText w:val="%5."/>
+      <w:lvlJc w:val="left"/>
+      <w:pPr>
+        <w:ind w:left="3600" w:hanging="360"/>
+      </w:pPr>
+    </w:lvl>
+    <w:lvl w:ilvl="5" w:tplc="0409001B" w:tentative="1">
+      <w:start w:val="1"/>
+      <w:numFmt w:val="lowerRoman"/>
+      <w:lvlText w:val="%6."/>
+      <w:lvlJc w:val="right"/>
+      <w:pPr>
+        <w:ind w:left="4320" w:hanging="180"/>
+      </w:pPr>
+    </w:lvl>
+    <w:lvl w:ilvl="6" w:tplc="0409000F" w:tentative="1">
+      <w:start w:val="1"/>
+      <w:numFmt w:val="decimal"/>
+      <w:lvlText w:val="%7."/>
+      <w:lvlJc w:val="left"/>
+      <w:pPr>
+        <w:ind w:left="5040" w:hanging="360"/>
+      </w:pPr>
+    </w:lvl>
+    <w:lvl w:ilvl="7" w:tplc="04090019" w:tentative="1">
+      <w:start w:val="1"/>
+      <w:numFmt w:val="lowerLetter"/>
+      <w:lvlText w:val="%8."/>
+      <w:lvlJc w:val="left"/>
+      <w:pPr>
+        <w:ind w:left="5760" w:hanging="360"/>
+      </w:pPr>
+    </w:lvl>
+    <w:lvl w:ilvl="8" w:tplc="0409001B" w:tentative="1">
+      <w:start w:val="1"/>
+      <w:numFmt w:val="lowerRoman"/>
+      <w:lvlText w:val="%9."/>
+      <w:lvlJc w:val="right"/>
+      <w:pPr>
+        <w:ind w:left="6480" w:hanging="180"/>
+      </w:pPr>
+    </w:lvl>
+  </w:abstractNum>
+  <w:abstractNum w:abstractNumId="2" w15:restartNumberingAfterBreak="0">
+    <w:nsid w:val="5AAF3176"/>
+    <w:multiLevelType w:val="hybridMultilevel"/>
+    <w:tmpl w:val="67F22D98"/>
+    <w:lvl w:ilvl="0" w:tplc="B874D1C0">
+      <w:start w:val="1"/>
+      <w:numFmt w:val="lowerRoman"/>
+      <w:lvlText w:val="(%1)"/>
+      <w:lvlJc w:val="left"/>
+      <w:pPr>
+        <w:ind w:left="1080" w:hanging="720"/>
+      </w:pPr>
+      <w:rPr>
+        <w:rFonts w:hint="default"/>
+      </w:rPr>
+    </w:lvl>
+    <w:lvl w:ilvl="1" w:tplc="04090019" w:tentative="1">
+      <w:start w:val="1"/>
+      <w:numFmt w:val="lowerLetter"/>
+      <w:lvlText w:val="%2."/>
+      <w:lvlJc w:val="left"/>
+      <w:pPr>
+        <w:ind w:left="1440" w:hanging="360"/>
+      </w:pPr>
+    </w:lvl>
+    <w:lvl w:ilvl="2" w:tplc="0409001B" w:tentative="1">
+      <w:start w:val="1"/>
+      <w:numFmt w:val="lowerRoman"/>
+      <w:lvlText w:val="%3."/>
+      <w:lvlJc w:val="right"/>
+      <w:pPr>
+        <w:ind w:left="2160" w:hanging="180"/>
+      </w:pPr>
+    </w:lvl>
+    <w:lvl w:ilvl="3" w:tplc="0409000F" w:tentative="1">
+      <w:start w:val="1"/>
+      <w:numFmt w:val="decimal"/>
+      <w:lvlText w:val="%4."/>
+      <w:lvlJc w:val="left"/>
+      <w:pPr>
+        <w:ind w:left="2880" w:hanging="360"/>
+      </w:pPr>
+    </w:lvl>
+    <w:lvl w:ilvl="4" w:tplc="04090019" w:tentative="1">
+      <w:start w:val="1"/>
+      <w:numFmt w:val="lowerLetter"/>
+      <w:lvlText w:val="%5."/>
+      <w:lvlJc w:val="left"/>
+      <w:pPr>
+        <w:ind w:left="3600" w:hanging="360"/>
+      </w:pPr>
+    </w:lvl>
+    <w:lvl w:ilvl="5" w:tplc="0409001B" w:tentative="1">
+      <w:start w:val="1"/>
+      <w:numFmt w:val="lowerRoman"/>
+      <w:lvlText w:val="%6."/>
+      <w:lvlJc w:val="right"/>
+      <w:pPr>
+        <w:ind w:left="4320" w:hanging="180"/>
+      </w:pPr>
+    </w:lvl>
+    <w:lvl w:ilvl="6" w:tplc="0409000F" w:tentative="1">
+      <w:start w:val="1"/>
+      <w:numFmt w:val="decimal"/>
+      <w:lvlText w:val="%7."/>
+      <w:lvlJc w:val="left"/>
+      <w:pPr>
+        <w:ind w:left="5040" w:hanging="360"/>
+      </w:pPr>
+    </w:lvl>
+    <w:lvl w:ilvl="7" w:tplc="04090019" w:tentative="1">
+      <w:start w:val="1"/>
+      <w:numFmt w:val="lowerLetter"/>
+      <w:lvlText w:val="%8."/>
+      <w:lvlJc w:val="left"/>
+      <w:pPr>
+        <w:ind w:left="5760" w:hanging="360"/>
+      </w:pPr>
+    </w:lvl>
+    <w:lvl w:ilvl="8" w:tplc="0409001B" w:tentative="1">
+      <w:start w:val="1"/>
+      <w:numFmt w:val="lowerRoman"/>
+      <w:lvlText w:val="%9."/>
+      <w:lvlJc w:val="right"/>
+      <w:pPr>
+        <w:ind w:left="6480" w:hanging="180"/>
+      </w:pPr>
+    </w:lvl>
+  </w:abstractNum>
+  <w:abstractNum w:abstractNumId="3" w15:restartNumberingAfterBreak="0">
     <w:nsid w:val="6D7616D9"/>
     <w:multiLevelType w:val="hybridMultilevel"/>
     <w:tmpl w:val="05E0DA54"/>
@@ -699,7 +1080,7 @@
       </w:pPr>
     </w:lvl>
   </w:abstractNum>
-  <w:abstractNum w:abstractNumId="2" w15:restartNumberingAfterBreak="0">
+  <w:abstractNum w:abstractNumId="4" w15:restartNumberingAfterBreak="0">
     <w:nsid w:val="769C0F59"/>
     <w:multiLevelType w:val="hybridMultilevel"/>
     <w:tmpl w:val="50507D8A"/>
@@ -788,7 +1169,7 @@
       </w:pPr>
     </w:lvl>
   </w:abstractNum>
-  <w:abstractNum w:abstractNumId="3" w15:restartNumberingAfterBreak="0">
+  <w:abstractNum w:abstractNumId="5" w15:restartNumberingAfterBreak="0">
     <w:nsid w:val="7A0603EF"/>
     <w:multiLevelType w:val="hybridMultilevel"/>
     <w:tmpl w:val="35A69D8E"/>
@@ -878,16 +1259,22 @@
     </w:lvl>
   </w:abstractNum>
   <w:num w:numId="1" w16cid:durableId="1484156709">
-    <w:abstractNumId w:val="3"/>
+    <w:abstractNumId w:val="5"/>
   </w:num>
   <w:num w:numId="2" w16cid:durableId="489521039">
-    <w:abstractNumId w:val="2"/>
+    <w:abstractNumId w:val="4"/>
   </w:num>
   <w:num w:numId="3" w16cid:durableId="1678998727">
     <w:abstractNumId w:val="0"/>
   </w:num>
   <w:num w:numId="4" w16cid:durableId="1580479748">
+    <w:abstractNumId w:val="3"/>
+  </w:num>
+  <w:num w:numId="5" w16cid:durableId="110631135">
     <w:abstractNumId w:val="1"/>
+  </w:num>
+  <w:num w:numId="6" w16cid:durableId="518390555">
+    <w:abstractNumId w:val="2"/>
   </w:num>
 </w:numbering>
 </file>

</xml_diff>

<commit_message>
updated report1 worked on topic 2 ligand-protein interaction
</commit_message>
<xml_diff>
--- a/reports/report 1.docx
+++ b/reports/report 1.docx
@@ -125,6 +125,7 @@
     <w:p/>
     <w:p>
       <w:pPr>
+        <w:jc w:val="center"/>
         <w:rPr>
           <w:b/>
           <w:bCs/>
@@ -135,9 +136,16 @@
         <w:rPr>
           <w:b/>
           <w:bCs/>
+        </w:rPr>
+        <w:lastRenderedPageBreak/>
+        <w:t xml:space="preserve">I </w:t>
+      </w:r>
+      <w:r>
+        <w:rPr>
+          <w:b/>
+          <w:bCs/>
           <w:u w:val="single"/>
         </w:rPr>
-        <w:lastRenderedPageBreak/>
         <w:t>PROTEINS:</w:t>
       </w:r>
     </w:p>
@@ -240,7 +248,13 @@
         </w:numPr>
       </w:pPr>
       <w:r>
-        <w:t xml:space="preserve"> A side chain (R group) - the only part that varies between amino acids and determines their chemical properties.</w:t>
+        <w:t xml:space="preserve"> A side chain (R group) </w:t>
+      </w:r>
+      <w:r>
+        <w:t>–</w:t>
+      </w:r>
+      <w:r>
+        <w:t xml:space="preserve"> the only part that varies between amino acids and determines their chemical properties.</w:t>
       </w:r>
     </w:p>
     <w:p>
@@ -703,14 +717,321 @@
     <w:p/>
     <w:p>
       <w:pPr>
-        <w:ind w:left="360"/>
         <w:jc w:val="center"/>
-      </w:pPr>
-    </w:p>
-    <w:p>
-      <w:pPr>
-        <w:ind w:left="360"/>
-      </w:pPr>
+        <w:rPr>
+          <w:b/>
+          <w:bCs/>
+          <w:u w:val="single"/>
+        </w:rPr>
+      </w:pPr>
+      <w:r>
+        <w:rPr>
+          <w:b/>
+          <w:bCs/>
+        </w:rPr>
+        <w:t xml:space="preserve">II </w:t>
+      </w:r>
+      <w:r>
+        <w:rPr>
+          <w:b/>
+          <w:bCs/>
+          <w:u w:val="single"/>
+        </w:rPr>
+        <w:t>PROTEIN-LIGAND INTERACTION</w:t>
+      </w:r>
+    </w:p>
+    <w:p>
+      <w:pPr>
+        <w:rPr>
+          <w:b/>
+          <w:bCs/>
+          <w:u w:val="single"/>
+        </w:rPr>
+      </w:pPr>
+      <w:r>
+        <w:rPr>
+          <w:b/>
+          <w:bCs/>
+          <w:u w:val="single"/>
+        </w:rPr>
+        <w:t>ENZYME-SUBSTRATE INTERACTIONS:</w:t>
+      </w:r>
+    </w:p>
+    <w:p>
+      <w:pPr>
+        <w:pStyle w:val="ListParagraph"/>
+        <w:numPr>
+          <w:ilvl w:val="0"/>
+          <w:numId w:val="7"/>
+        </w:numPr>
+      </w:pPr>
+      <w:r>
+        <w:t>Enzymes are special proteins with a specific part typically referred to as the </w:t>
+      </w:r>
+      <w:r>
+        <w:rPr>
+          <w:i/>
+          <w:iCs/>
+        </w:rPr>
+        <w:t>“lock”</w:t>
+      </w:r>
+      <w:r>
+        <w:t> (active site)</w:t>
+      </w:r>
+      <w:r>
+        <w:t>.</w:t>
+      </w:r>
+    </w:p>
+    <w:p>
+      <w:pPr>
+        <w:pStyle w:val="ListParagraph"/>
+        <w:numPr>
+          <w:ilvl w:val="0"/>
+          <w:numId w:val="7"/>
+        </w:numPr>
+      </w:pPr>
+      <w:r>
+        <w:t>S</w:t>
+      </w:r>
+      <w:r>
+        <w:t>ubstrates are the </w:t>
+      </w:r>
+      <w:r>
+        <w:rPr>
+          <w:i/>
+          <w:iCs/>
+        </w:rPr>
+        <w:t>“keys”</w:t>
+      </w:r>
+      <w:r>
+        <w:t> (molecules) that fit into the </w:t>
+      </w:r>
+      <w:r>
+        <w:rPr>
+          <w:i/>
+          <w:iCs/>
+        </w:rPr>
+        <w:t>lock</w:t>
+      </w:r>
+      <w:r>
+        <w:t>.</w:t>
+      </w:r>
+    </w:p>
+    <w:p>
+      <w:pPr>
+        <w:pStyle w:val="ListParagraph"/>
+        <w:numPr>
+          <w:ilvl w:val="0"/>
+          <w:numId w:val="7"/>
+        </w:numPr>
+      </w:pPr>
+      <w:r>
+        <w:t>When a substrate binds to a</w:t>
+      </w:r>
+      <w:r>
+        <w:t>n</w:t>
+      </w:r>
+      <w:r>
+        <w:t xml:space="preserve"> enzyme, it undergoes a chemical reaction and is converted into a product.</w:t>
+      </w:r>
+    </w:p>
+    <w:p>
+      <w:pPr>
+        <w:pStyle w:val="ListParagraph"/>
+        <w:numPr>
+          <w:ilvl w:val="0"/>
+          <w:numId w:val="7"/>
+        </w:numPr>
+      </w:pPr>
+      <w:r>
+        <w:lastRenderedPageBreak/>
+        <w:t>Enzyme releases the product after the reaction and returns to its original shape.</w:t>
+      </w:r>
+    </w:p>
+    <w:p>
+      <w:pPr>
+        <w:pStyle w:val="ListParagraph"/>
+        <w:ind w:left="813"/>
+      </w:pPr>
+    </w:p>
+    <w:p>
+      <w:pPr>
+        <w:pStyle w:val="ListParagraph"/>
+        <w:ind w:left="813"/>
+        <w:jc w:val="center"/>
+      </w:pPr>
+      <w:r>
+        <w:drawing>
+          <wp:inline distT="0" distB="0" distL="0" distR="0" wp14:anchorId="5AD15070" wp14:editId="2B07D033">
+            <wp:extent cx="5006774" cy="2865368"/>
+            <wp:effectExtent l="0" t="0" r="3810" b="0"/>
+            <wp:docPr id="71259148" name="Picture 1"/>
+            <wp:cNvGraphicFramePr>
+              <a:graphicFrameLocks xmlns:a="http://schemas.openxmlformats.org/drawingml/2006/main" noChangeAspect="1"/>
+            </wp:cNvGraphicFramePr>
+            <a:graphic xmlns:a="http://schemas.openxmlformats.org/drawingml/2006/main">
+              <a:graphicData uri="http://schemas.openxmlformats.org/drawingml/2006/picture">
+                <pic:pic xmlns:pic="http://schemas.openxmlformats.org/drawingml/2006/picture">
+                  <pic:nvPicPr>
+                    <pic:cNvPr id="71259148" name=""/>
+                    <pic:cNvPicPr/>
+                  </pic:nvPicPr>
+                  <pic:blipFill>
+                    <a:blip r:embed="rId9"/>
+                    <a:stretch>
+                      <a:fillRect/>
+                    </a:stretch>
+                  </pic:blipFill>
+                  <pic:spPr>
+                    <a:xfrm>
+                      <a:off x="0" y="0"/>
+                      <a:ext cx="5006774" cy="2865368"/>
+                    </a:xfrm>
+                    <a:prstGeom prst="rect">
+                      <a:avLst/>
+                    </a:prstGeom>
+                  </pic:spPr>
+                </pic:pic>
+              </a:graphicData>
+            </a:graphic>
+          </wp:inline>
+        </w:drawing>
+      </w:r>
+    </w:p>
+    <w:p/>
+    <w:p>
+      <w:pPr>
+        <w:rPr>
+          <w:b/>
+          <w:bCs/>
+          <w:u w:val="single"/>
+        </w:rPr>
+      </w:pPr>
+      <w:r>
+        <w:rPr>
+          <w:b/>
+          <w:bCs/>
+          <w:u w:val="single"/>
+        </w:rPr>
+        <w:t>PROTEIN-NUCLEIC ACID INTERACTIONS:</w:t>
+      </w:r>
+    </w:p>
+    <w:p>
+      <w:pPr>
+        <w:pStyle w:val="ListParagraph"/>
+        <w:numPr>
+          <w:ilvl w:val="0"/>
+          <w:numId w:val="8"/>
+        </w:numPr>
+      </w:pPr>
+      <w:r>
+        <w:t>Proteins can connect to nucleic acids (DNA and RNA) to regulate gene expression, DNA replication, and RNA processing.</w:t>
+      </w:r>
+    </w:p>
+    <w:p>
+      <w:pPr>
+        <w:pStyle w:val="ListParagraph"/>
+        <w:numPr>
+          <w:ilvl w:val="0"/>
+          <w:numId w:val="8"/>
+        </w:numPr>
+      </w:pPr>
+      <w:r>
+        <w:t>S</w:t>
+      </w:r>
+      <w:r>
+        <w:t>ome proteins can bind to specific spots in the DNA and prevent those spots from being “read”, ensuring that genes are activated or suppressed when needed</w:t>
+      </w:r>
+      <w:r>
+        <w:t>.</w:t>
+      </w:r>
+    </w:p>
+    <w:p>
+      <w:pPr>
+        <w:pStyle w:val="ListParagraph"/>
+        <w:ind w:left="1080"/>
+      </w:pPr>
+    </w:p>
+    <w:p>
+      <w:pPr>
+        <w:pStyle w:val="ListParagraph"/>
+        <w:ind w:left="1080"/>
+        <w:jc w:val="center"/>
+      </w:pPr>
+      <w:r>
+        <w:drawing>
+          <wp:inline distT="0" distB="0" distL="0" distR="0" wp14:anchorId="126A88B7" wp14:editId="07174390">
+            <wp:extent cx="3596640" cy="2487677"/>
+            <wp:effectExtent l="0" t="0" r="3810" b="8255"/>
+            <wp:docPr id="1947820370" name="Picture 1"/>
+            <wp:cNvGraphicFramePr>
+              <a:graphicFrameLocks xmlns:a="http://schemas.openxmlformats.org/drawingml/2006/main" noChangeAspect="1"/>
+            </wp:cNvGraphicFramePr>
+            <a:graphic xmlns:a="http://schemas.openxmlformats.org/drawingml/2006/main">
+              <a:graphicData uri="http://schemas.openxmlformats.org/drawingml/2006/picture">
+                <pic:pic xmlns:pic="http://schemas.openxmlformats.org/drawingml/2006/picture">
+                  <pic:nvPicPr>
+                    <pic:cNvPr id="1947820370" name=""/>
+                    <pic:cNvPicPr/>
+                  </pic:nvPicPr>
+                  <pic:blipFill>
+                    <a:blip r:embed="rId10"/>
+                    <a:stretch>
+                      <a:fillRect/>
+                    </a:stretch>
+                  </pic:blipFill>
+                  <pic:spPr>
+                    <a:xfrm>
+                      <a:off x="0" y="0"/>
+                      <a:ext cx="3609729" cy="2496730"/>
+                    </a:xfrm>
+                    <a:prstGeom prst="rect">
+                      <a:avLst/>
+                    </a:prstGeom>
+                  </pic:spPr>
+                </pic:pic>
+              </a:graphicData>
+            </a:graphic>
+          </wp:inline>
+        </w:drawing>
+      </w:r>
+    </w:p>
+    <w:p>
+      <w:pPr>
+        <w:pStyle w:val="ListParagraph"/>
+        <w:ind w:left="1080"/>
+        <w:jc w:val="center"/>
+      </w:pPr>
+    </w:p>
+    <w:p>
+      <w:pPr>
+        <w:rPr>
+          <w:b/>
+          <w:bCs/>
+          <w:u w:val="single"/>
+        </w:rPr>
+      </w:pPr>
+      <w:r>
+        <w:rPr>
+          <w:b/>
+          <w:bCs/>
+          <w:u w:val="single"/>
+        </w:rPr>
+        <w:lastRenderedPageBreak/>
+        <w:t>BINDING AFFINITY AND DISSOCIATION CONSTANT:</w:t>
+      </w:r>
+    </w:p>
+    <w:p>
+      <w:pPr>
+        <w:pStyle w:val="ListParagraph"/>
+        <w:numPr>
+          <w:ilvl w:val="0"/>
+          <w:numId w:val="9"/>
+        </w:numPr>
+      </w:pPr>
+      <w:r>
+        <w:t>Binding affinity is the measure of how tightly a ligand binds with the active site.</w:t>
+      </w:r>
     </w:p>
     <w:sectPr>
       <w:pgSz w:w="12240" w:h="15840"/>
@@ -725,6 +1046,181 @@
 <file path=word/numbering.xml><?xml version="1.0" encoding="utf-8"?>
 <w:numbering xmlns:wpc="http://schemas.microsoft.com/office/word/2010/wordprocessingCanvas" xmlns:cx="http://schemas.microsoft.com/office/drawing/2014/chartex" xmlns:cx1="http://schemas.microsoft.com/office/drawing/2015/9/8/chartex" xmlns:cx2="http://schemas.microsoft.com/office/drawing/2015/10/21/chartex" xmlns:cx3="http://schemas.microsoft.com/office/drawing/2016/5/9/chartex" xmlns:cx4="http://schemas.microsoft.com/office/drawing/2016/5/10/chartex" xmlns:cx5="http://schemas.microsoft.com/office/drawing/2016/5/11/chartex" xmlns:cx6="http://schemas.microsoft.com/office/drawing/2016/5/12/chartex" xmlns:cx7="http://schemas.microsoft.com/office/drawing/2016/5/13/chartex" xmlns:cx8="http://schemas.microsoft.com/office/drawing/2016/5/14/chartex" xmlns:mc="http://schemas.openxmlformats.org/markup-compatibility/2006" xmlns:aink="http://schemas.microsoft.com/office/drawing/2016/ink" xmlns:am3d="http://schemas.microsoft.com/office/drawing/2017/model3d" xmlns:o="urn:schemas-microsoft-com:office:office" xmlns:oel="http://schemas.microsoft.com/office/2019/extlst" xmlns:r="http://schemas.openxmlformats.org/officeDocument/2006/relationships" xmlns:m="http://schemas.openxmlformats.org/officeDocument/2006/math" xmlns:v="urn:schemas-microsoft-com:vml" xmlns:wp14="http://schemas.microsoft.com/office/word/2010/wordprocessingDrawing" xmlns:wp="http://schemas.openxmlformats.org/drawingml/2006/wordprocessingDrawing" xmlns:w10="urn:schemas-microsoft-com:office:word" xmlns:w="http://schemas.openxmlformats.org/wordprocessingml/2006/main" xmlns:w14="http://schemas.microsoft.com/office/word/2010/wordml" xmlns:w15="http://schemas.microsoft.com/office/word/2012/wordml" xmlns:w16cei="http://schemas.microsoft.com/office/word/2026/wordml/cei" xmlns:w16cex="http://schemas.microsoft.com/office/word/2018/wordml/cex" xmlns:w16cid="http://schemas.microsoft.com/office/word/2016/wordml/cid" xmlns:w16="http://schemas.microsoft.com/office/word/2018/wordml" xmlns:w16du="http://schemas.microsoft.com/office/word/2023/wordml/word16du" xmlns:w16sdtdh="http://schemas.microsoft.com/office/word/2020/wordml/sdtdatahash" xmlns:w16sdtfl="http://schemas.microsoft.com/office/word/2024/wordml/sdtformatlock" xmlns:w16se="http://schemas.microsoft.com/office/word/2015/wordml/symex" xmlns:wpg="http://schemas.microsoft.com/office/word/2010/wordprocessingGroup" xmlns:wpi="http://schemas.microsoft.com/office/word/2010/wordprocessingInk" xmlns:wne="http://schemas.microsoft.com/office/word/2006/wordml" xmlns:wps="http://schemas.microsoft.com/office/word/2010/wordprocessingShape" mc:Ignorable="w14 w15 w16se w16cid w16 w16cex w16sdtdh w16sdtfl w16du wp14">
   <w:abstractNum w:abstractNumId="0" w15:restartNumberingAfterBreak="0">
+    <w:nsid w:val="1D4D49EA"/>
+    <w:multiLevelType w:val="hybridMultilevel"/>
+    <w:tmpl w:val="A6442F6A"/>
+    <w:lvl w:ilvl="0" w:tplc="0409001B">
+      <w:start w:val="1"/>
+      <w:numFmt w:val="lowerRoman"/>
+      <w:lvlText w:val="%1."/>
+      <w:lvlJc w:val="right"/>
+      <w:pPr>
+        <w:ind w:left="813" w:hanging="360"/>
+      </w:pPr>
+    </w:lvl>
+    <w:lvl w:ilvl="1" w:tplc="04090019" w:tentative="1">
+      <w:start w:val="1"/>
+      <w:numFmt w:val="lowerLetter"/>
+      <w:lvlText w:val="%2."/>
+      <w:lvlJc w:val="left"/>
+      <w:pPr>
+        <w:ind w:left="1533" w:hanging="360"/>
+      </w:pPr>
+    </w:lvl>
+    <w:lvl w:ilvl="2" w:tplc="0409001B" w:tentative="1">
+      <w:start w:val="1"/>
+      <w:numFmt w:val="lowerRoman"/>
+      <w:lvlText w:val="%3."/>
+      <w:lvlJc w:val="right"/>
+      <w:pPr>
+        <w:ind w:left="2253" w:hanging="180"/>
+      </w:pPr>
+    </w:lvl>
+    <w:lvl w:ilvl="3" w:tplc="0409000F" w:tentative="1">
+      <w:start w:val="1"/>
+      <w:numFmt w:val="decimal"/>
+      <w:lvlText w:val="%4."/>
+      <w:lvlJc w:val="left"/>
+      <w:pPr>
+        <w:ind w:left="2973" w:hanging="360"/>
+      </w:pPr>
+    </w:lvl>
+    <w:lvl w:ilvl="4" w:tplc="04090019" w:tentative="1">
+      <w:start w:val="1"/>
+      <w:numFmt w:val="lowerLetter"/>
+      <w:lvlText w:val="%5."/>
+      <w:lvlJc w:val="left"/>
+      <w:pPr>
+        <w:ind w:left="3693" w:hanging="360"/>
+      </w:pPr>
+    </w:lvl>
+    <w:lvl w:ilvl="5" w:tplc="0409001B" w:tentative="1">
+      <w:start w:val="1"/>
+      <w:numFmt w:val="lowerRoman"/>
+      <w:lvlText w:val="%6."/>
+      <w:lvlJc w:val="right"/>
+      <w:pPr>
+        <w:ind w:left="4413" w:hanging="180"/>
+      </w:pPr>
+    </w:lvl>
+    <w:lvl w:ilvl="6" w:tplc="0409000F" w:tentative="1">
+      <w:start w:val="1"/>
+      <w:numFmt w:val="decimal"/>
+      <w:lvlText w:val="%7."/>
+      <w:lvlJc w:val="left"/>
+      <w:pPr>
+        <w:ind w:left="5133" w:hanging="360"/>
+      </w:pPr>
+    </w:lvl>
+    <w:lvl w:ilvl="7" w:tplc="04090019" w:tentative="1">
+      <w:start w:val="1"/>
+      <w:numFmt w:val="lowerLetter"/>
+      <w:lvlText w:val="%8."/>
+      <w:lvlJc w:val="left"/>
+      <w:pPr>
+        <w:ind w:left="5853" w:hanging="360"/>
+      </w:pPr>
+    </w:lvl>
+    <w:lvl w:ilvl="8" w:tplc="0409001B" w:tentative="1">
+      <w:start w:val="1"/>
+      <w:numFmt w:val="lowerRoman"/>
+      <w:lvlText w:val="%9."/>
+      <w:lvlJc w:val="right"/>
+      <w:pPr>
+        <w:ind w:left="6573" w:hanging="180"/>
+      </w:pPr>
+    </w:lvl>
+  </w:abstractNum>
+  <w:abstractNum w:abstractNumId="1" w15:restartNumberingAfterBreak="0">
+    <w:nsid w:val="298A5DC8"/>
+    <w:multiLevelType w:val="hybridMultilevel"/>
+    <w:tmpl w:val="A32E858A"/>
+    <w:lvl w:ilvl="0" w:tplc="F854709C">
+      <w:start w:val="1"/>
+      <w:numFmt w:val="lowerRoman"/>
+      <w:lvlText w:val="%1."/>
+      <w:lvlJc w:val="left"/>
+      <w:pPr>
+        <w:ind w:left="1080" w:hanging="720"/>
+      </w:pPr>
+      <w:rPr>
+        <w:rFonts w:hint="default"/>
+      </w:rPr>
+    </w:lvl>
+    <w:lvl w:ilvl="1" w:tplc="04090019" w:tentative="1">
+      <w:start w:val="1"/>
+      <w:numFmt w:val="lowerLetter"/>
+      <w:lvlText w:val="%2."/>
+      <w:lvlJc w:val="left"/>
+      <w:pPr>
+        <w:ind w:left="1440" w:hanging="360"/>
+      </w:pPr>
+    </w:lvl>
+    <w:lvl w:ilvl="2" w:tplc="0409001B" w:tentative="1">
+      <w:start w:val="1"/>
+      <w:numFmt w:val="lowerRoman"/>
+      <w:lvlText w:val="%3."/>
+      <w:lvlJc w:val="right"/>
+      <w:pPr>
+        <w:ind w:left="2160" w:hanging="180"/>
+      </w:pPr>
+    </w:lvl>
+    <w:lvl w:ilvl="3" w:tplc="0409000F" w:tentative="1">
+      <w:start w:val="1"/>
+      <w:numFmt w:val="decimal"/>
+      <w:lvlText w:val="%4."/>
+      <w:lvlJc w:val="left"/>
+      <w:pPr>
+        <w:ind w:left="2880" w:hanging="360"/>
+      </w:pPr>
+    </w:lvl>
+    <w:lvl w:ilvl="4" w:tplc="04090019" w:tentative="1">
+      <w:start w:val="1"/>
+      <w:numFmt w:val="lowerLetter"/>
+      <w:lvlText w:val="%5."/>
+      <w:lvlJc w:val="left"/>
+      <w:pPr>
+        <w:ind w:left="3600" w:hanging="360"/>
+      </w:pPr>
+    </w:lvl>
+    <w:lvl w:ilvl="5" w:tplc="0409001B" w:tentative="1">
+      <w:start w:val="1"/>
+      <w:numFmt w:val="lowerRoman"/>
+      <w:lvlText w:val="%6."/>
+      <w:lvlJc w:val="right"/>
+      <w:pPr>
+        <w:ind w:left="4320" w:hanging="180"/>
+      </w:pPr>
+    </w:lvl>
+    <w:lvl w:ilvl="6" w:tplc="0409000F" w:tentative="1">
+      <w:start w:val="1"/>
+      <w:numFmt w:val="decimal"/>
+      <w:lvlText w:val="%7."/>
+      <w:lvlJc w:val="left"/>
+      <w:pPr>
+        <w:ind w:left="5040" w:hanging="360"/>
+      </w:pPr>
+    </w:lvl>
+    <w:lvl w:ilvl="7" w:tplc="04090019" w:tentative="1">
+      <w:start w:val="1"/>
+      <w:numFmt w:val="lowerLetter"/>
+      <w:lvlText w:val="%8."/>
+      <w:lvlJc w:val="left"/>
+      <w:pPr>
+        <w:ind w:left="5760" w:hanging="360"/>
+      </w:pPr>
+    </w:lvl>
+    <w:lvl w:ilvl="8" w:tplc="0409001B" w:tentative="1">
+      <w:start w:val="1"/>
+      <w:numFmt w:val="lowerRoman"/>
+      <w:lvlText w:val="%9."/>
+      <w:lvlJc w:val="right"/>
+      <w:pPr>
+        <w:ind w:left="6480" w:hanging="180"/>
+      </w:pPr>
+    </w:lvl>
+  </w:abstractNum>
+  <w:abstractNum w:abstractNumId="2" w15:restartNumberingAfterBreak="0">
     <w:nsid w:val="3EE94185"/>
     <w:multiLevelType w:val="hybridMultilevel"/>
     <w:tmpl w:val="7F3EE356"/>
@@ -813,7 +1309,7 @@
       </w:pPr>
     </w:lvl>
   </w:abstractNum>
-  <w:abstractNum w:abstractNumId="1" w15:restartNumberingAfterBreak="0">
+  <w:abstractNum w:abstractNumId="3" w15:restartNumberingAfterBreak="0">
     <w:nsid w:val="443D1176"/>
     <w:multiLevelType w:val="hybridMultilevel"/>
     <w:tmpl w:val="A35803FA"/>
@@ -902,7 +1398,96 @@
       </w:pPr>
     </w:lvl>
   </w:abstractNum>
-  <w:abstractNum w:abstractNumId="2" w15:restartNumberingAfterBreak="0">
+  <w:abstractNum w:abstractNumId="4" w15:restartNumberingAfterBreak="0">
+    <w:nsid w:val="47A706B3"/>
+    <w:multiLevelType w:val="hybridMultilevel"/>
+    <w:tmpl w:val="31A84218"/>
+    <w:lvl w:ilvl="0" w:tplc="2EAAA62A">
+      <w:start w:val="1"/>
+      <w:numFmt w:val="lowerRoman"/>
+      <w:lvlText w:val="%1."/>
+      <w:lvlJc w:val="left"/>
+      <w:pPr>
+        <w:ind w:left="1080" w:hanging="720"/>
+      </w:pPr>
+      <w:rPr>
+        <w:rFonts w:hint="default"/>
+      </w:rPr>
+    </w:lvl>
+    <w:lvl w:ilvl="1" w:tplc="04090019" w:tentative="1">
+      <w:start w:val="1"/>
+      <w:numFmt w:val="lowerLetter"/>
+      <w:lvlText w:val="%2."/>
+      <w:lvlJc w:val="left"/>
+      <w:pPr>
+        <w:ind w:left="1440" w:hanging="360"/>
+      </w:pPr>
+    </w:lvl>
+    <w:lvl w:ilvl="2" w:tplc="0409001B" w:tentative="1">
+      <w:start w:val="1"/>
+      <w:numFmt w:val="lowerRoman"/>
+      <w:lvlText w:val="%3."/>
+      <w:lvlJc w:val="right"/>
+      <w:pPr>
+        <w:ind w:left="2160" w:hanging="180"/>
+      </w:pPr>
+    </w:lvl>
+    <w:lvl w:ilvl="3" w:tplc="0409000F" w:tentative="1">
+      <w:start w:val="1"/>
+      <w:numFmt w:val="decimal"/>
+      <w:lvlText w:val="%4."/>
+      <w:lvlJc w:val="left"/>
+      <w:pPr>
+        <w:ind w:left="2880" w:hanging="360"/>
+      </w:pPr>
+    </w:lvl>
+    <w:lvl w:ilvl="4" w:tplc="04090019" w:tentative="1">
+      <w:start w:val="1"/>
+      <w:numFmt w:val="lowerLetter"/>
+      <w:lvlText w:val="%5."/>
+      <w:lvlJc w:val="left"/>
+      <w:pPr>
+        <w:ind w:left="3600" w:hanging="360"/>
+      </w:pPr>
+    </w:lvl>
+    <w:lvl w:ilvl="5" w:tplc="0409001B" w:tentative="1">
+      <w:start w:val="1"/>
+      <w:numFmt w:val="lowerRoman"/>
+      <w:lvlText w:val="%6."/>
+      <w:lvlJc w:val="right"/>
+      <w:pPr>
+        <w:ind w:left="4320" w:hanging="180"/>
+      </w:pPr>
+    </w:lvl>
+    <w:lvl w:ilvl="6" w:tplc="0409000F" w:tentative="1">
+      <w:start w:val="1"/>
+      <w:numFmt w:val="decimal"/>
+      <w:lvlText w:val="%7."/>
+      <w:lvlJc w:val="left"/>
+      <w:pPr>
+        <w:ind w:left="5040" w:hanging="360"/>
+      </w:pPr>
+    </w:lvl>
+    <w:lvl w:ilvl="7" w:tplc="04090019" w:tentative="1">
+      <w:start w:val="1"/>
+      <w:numFmt w:val="lowerLetter"/>
+      <w:lvlText w:val="%8."/>
+      <w:lvlJc w:val="left"/>
+      <w:pPr>
+        <w:ind w:left="5760" w:hanging="360"/>
+      </w:pPr>
+    </w:lvl>
+    <w:lvl w:ilvl="8" w:tplc="0409001B" w:tentative="1">
+      <w:start w:val="1"/>
+      <w:numFmt w:val="lowerRoman"/>
+      <w:lvlText w:val="%9."/>
+      <w:lvlJc w:val="right"/>
+      <w:pPr>
+        <w:ind w:left="6480" w:hanging="180"/>
+      </w:pPr>
+    </w:lvl>
+  </w:abstractNum>
+  <w:abstractNum w:abstractNumId="5" w15:restartNumberingAfterBreak="0">
     <w:nsid w:val="5AAF3176"/>
     <w:multiLevelType w:val="hybridMultilevel"/>
     <w:tmpl w:val="67F22D98"/>
@@ -991,7 +1576,7 @@
       </w:pPr>
     </w:lvl>
   </w:abstractNum>
-  <w:abstractNum w:abstractNumId="3" w15:restartNumberingAfterBreak="0">
+  <w:abstractNum w:abstractNumId="6" w15:restartNumberingAfterBreak="0">
     <w:nsid w:val="6D7616D9"/>
     <w:multiLevelType w:val="hybridMultilevel"/>
     <w:tmpl w:val="05E0DA54"/>
@@ -1080,7 +1665,7 @@
       </w:pPr>
     </w:lvl>
   </w:abstractNum>
-  <w:abstractNum w:abstractNumId="4" w15:restartNumberingAfterBreak="0">
+  <w:abstractNum w:abstractNumId="7" w15:restartNumberingAfterBreak="0">
     <w:nsid w:val="769C0F59"/>
     <w:multiLevelType w:val="hybridMultilevel"/>
     <w:tmpl w:val="50507D8A"/>
@@ -1169,7 +1754,7 @@
       </w:pPr>
     </w:lvl>
   </w:abstractNum>
-  <w:abstractNum w:abstractNumId="5" w15:restartNumberingAfterBreak="0">
+  <w:abstractNum w:abstractNumId="8" w15:restartNumberingAfterBreak="0">
     <w:nsid w:val="7A0603EF"/>
     <w:multiLevelType w:val="hybridMultilevel"/>
     <w:tmpl w:val="35A69D8E"/>
@@ -1259,22 +1844,31 @@
     </w:lvl>
   </w:abstractNum>
   <w:num w:numId="1" w16cid:durableId="1484156709">
+    <w:abstractNumId w:val="8"/>
+  </w:num>
+  <w:num w:numId="2" w16cid:durableId="489521039">
+    <w:abstractNumId w:val="7"/>
+  </w:num>
+  <w:num w:numId="3" w16cid:durableId="1678998727">
+    <w:abstractNumId w:val="2"/>
+  </w:num>
+  <w:num w:numId="4" w16cid:durableId="1580479748">
+    <w:abstractNumId w:val="6"/>
+  </w:num>
+  <w:num w:numId="5" w16cid:durableId="110631135">
+    <w:abstractNumId w:val="3"/>
+  </w:num>
+  <w:num w:numId="6" w16cid:durableId="518390555">
     <w:abstractNumId w:val="5"/>
   </w:num>
-  <w:num w:numId="2" w16cid:durableId="489521039">
-    <w:abstractNumId w:val="4"/>
-  </w:num>
-  <w:num w:numId="3" w16cid:durableId="1678998727">
+  <w:num w:numId="7" w16cid:durableId="1060907704">
     <w:abstractNumId w:val="0"/>
   </w:num>
-  <w:num w:numId="4" w16cid:durableId="1580479748">
-    <w:abstractNumId w:val="3"/>
-  </w:num>
-  <w:num w:numId="5" w16cid:durableId="110631135">
+  <w:num w:numId="8" w16cid:durableId="227619355">
     <w:abstractNumId w:val="1"/>
   </w:num>
-  <w:num w:numId="6" w16cid:durableId="518390555">
-    <w:abstractNumId w:val="2"/>
+  <w:num w:numId="9" w16cid:durableId="390158098">
+    <w:abstractNumId w:val="4"/>
   </w:num>
 </w:numbering>
 </file>
@@ -1882,7 +2476,6 @@
   <w:style w:type="character" w:default="1" w:styleId="DefaultParagraphFont">
     <w:name w:val="Default Paragraph Font"/>
     <w:uiPriority w:val="1"/>
-    <w:semiHidden/>
     <w:unhideWhenUsed/>
   </w:style>
   <w:style w:type="table" w:default="1" w:styleId="TableNormal">

</xml_diff>